<commit_message>
docs(dp): correction périodes — durée du projet (06/2024–06/2026)
Les 9 exemples avaient des dates par feature. Correction : période du
projet Zone01 Rouen Normandie, Juin 2024 → Juin 2026.

Co-Authored-By: Claude Sonnet 4.6 <noreply@anthropic.com>
</commit_message>
<xml_diff>
--- a/dossier-certification/Dossier_Professionnel_Social_Network_COMPLET.docx
+++ b/dossier-certification/Dossier_Professionnel_Social_Network_COMPLET.docx
@@ -7575,7 +7575,7 @@
                     <w:szCs w:val="22"/>
                     <w:lang w:val="fr-FR" w:eastAsia="en-US" w:bidi="ar-SA"/>
                   </w:rPr>
-                  <w:t>01/06/2025</w:t>
+                  <w:t>01/06/2024</w:t>
                 </w:r>
               </w:sdtContent>
             </w:sdt>
@@ -9105,7 +9105,7 @@
                     <w:szCs w:val="22"/>
                     <w:lang w:val="fr-FR" w:eastAsia="en-US" w:bidi="ar-SA"/>
                   </w:rPr>
-                  <w:t>01/06/2025</w:t>
+                  <w:t>01/06/2024</w:t>
                 </w:r>
               </w:sdtContent>
             </w:sdt>
@@ -10637,7 +10637,7 @@
                     <w:szCs w:val="22"/>
                     <w:lang w:val="fr-FR" w:eastAsia="en-US" w:bidi="ar-SA"/>
                   </w:rPr>
-                  <w:t>01/07/2025</w:t>
+                  <w:t>01/06/2024</w:t>
                 </w:r>
               </w:sdtContent>
             </w:sdt>
@@ -10734,7 +10734,7 @@
                     <w:szCs w:val="22"/>
                     <w:lang w:val="fr-FR" w:eastAsia="en-US" w:bidi="ar-SA"/>
                   </w:rPr>
-                  <w:t>01/07/2025</w:t>
+                  <w:t>01/06/2026</w:t>
                 </w:r>
               </w:sdtContent>
             </w:sdt>
@@ -12484,7 +12484,7 @@
                     <w:szCs w:val="22"/>
                     <w:lang w:val="fr-FR" w:eastAsia="en-US" w:bidi="ar-SA"/>
                   </w:rPr>
-                  <w:t>01/05/2025</w:t>
+                  <w:t>01/06/2024</w:t>
                 </w:r>
               </w:sdtContent>
             </w:sdt>
@@ -14014,7 +14014,7 @@
                     <w:szCs w:val="22"/>
                     <w:lang w:val="fr-FR" w:eastAsia="en-US" w:bidi="ar-SA"/>
                   </w:rPr>
-                  <w:t>01/07/2025</w:t>
+                  <w:t>01/06/2024</w:t>
                 </w:r>
               </w:sdtContent>
             </w:sdt>
@@ -15545,7 +15545,7 @@
                     <w:szCs w:val="22"/>
                     <w:lang w:val="fr-FR" w:eastAsia="en-US" w:bidi="ar-SA"/>
                   </w:rPr>
-                  <w:t>01/05/2025</w:t>
+                  <w:t>01/06/2024</w:t>
                 </w:r>
               </w:sdtContent>
             </w:sdt>
@@ -15642,7 +15642,7 @@
                     <w:szCs w:val="22"/>
                     <w:lang w:val="fr-FR" w:eastAsia="en-US" w:bidi="ar-SA"/>
                   </w:rPr>
-                  <w:t>01/07/2025</w:t>
+                  <w:t>01/06/2026</w:t>
                 </w:r>
               </w:sdtContent>
             </w:sdt>
@@ -17392,7 +17392,7 @@
                     <w:szCs w:val="22"/>
                     <w:lang w:val="fr-FR" w:eastAsia="en-US" w:bidi="ar-SA"/>
                   </w:rPr>
-                  <w:t>01/08/2025</w:t>
+                  <w:t>01/06/2024</w:t>
                 </w:r>
               </w:sdtContent>
             </w:sdt>
@@ -18925,7 +18925,7 @@
                     <w:szCs w:val="22"/>
                     <w:lang w:val="fr-FR" w:eastAsia="en-US" w:bidi="ar-SA"/>
                   </w:rPr>
-                  <w:t>01/09/2025</w:t>
+                  <w:t>01/06/2024</w:t>
                 </w:r>
               </w:sdtContent>
             </w:sdt>
@@ -20454,7 +20454,7 @@
                     <w:szCs w:val="22"/>
                     <w:lang w:val="fr-FR" w:eastAsia="en-US" w:bidi="ar-SA"/>
                   </w:rPr>
-                  <w:t>01/04/2026</w:t>
+                  <w:t>01/06/2024</w:t>
                 </w:r>
               </w:sdtContent>
             </w:sdt>

</xml_diff>

<commit_message>
docs(dp): périodes = premier/dernier commit du projet (26/05/2025–22/05/2026)
Co-Authored-By: Claude Sonnet 4.6 <noreply@anthropic.com>
</commit_message>
<xml_diff>
--- a/dossier-certification/Dossier_Professionnel_Social_Network_COMPLET.docx
+++ b/dossier-certification/Dossier_Professionnel_Social_Network_COMPLET.docx
@@ -7575,7 +7575,7 @@
                     <w:szCs w:val="22"/>
                     <w:lang w:val="fr-FR" w:eastAsia="en-US" w:bidi="ar-SA"/>
                   </w:rPr>
-                  <w:t>01/06/2024</w:t>
+                  <w:t>26/05/2025</w:t>
                 </w:r>
               </w:sdtContent>
             </w:sdt>
@@ -7672,7 +7672,7 @@
                     <w:szCs w:val="22"/>
                     <w:lang w:val="fr-FR" w:eastAsia="en-US" w:bidi="ar-SA"/>
                   </w:rPr>
-                  <w:t>01/06/2026</w:t>
+                  <w:t>22/05/2026</w:t>
                 </w:r>
               </w:sdtContent>
             </w:sdt>
@@ -9105,7 +9105,7 @@
                     <w:szCs w:val="22"/>
                     <w:lang w:val="fr-FR" w:eastAsia="en-US" w:bidi="ar-SA"/>
                   </w:rPr>
-                  <w:t>01/06/2024</w:t>
+                  <w:t>26/05/2025</w:t>
                 </w:r>
               </w:sdtContent>
             </w:sdt>
@@ -9202,7 +9202,7 @@
                     <w:szCs w:val="22"/>
                     <w:lang w:val="fr-FR" w:eastAsia="en-US" w:bidi="ar-SA"/>
                   </w:rPr>
-                  <w:t>01/06/2026</w:t>
+                  <w:t>22/05/2026</w:t>
                 </w:r>
               </w:sdtContent>
             </w:sdt>
@@ -10637,7 +10637,7 @@
                     <w:szCs w:val="22"/>
                     <w:lang w:val="fr-FR" w:eastAsia="en-US" w:bidi="ar-SA"/>
                   </w:rPr>
-                  <w:t>01/06/2024</w:t>
+                  <w:t>26/05/2025</w:t>
                 </w:r>
               </w:sdtContent>
             </w:sdt>
@@ -10734,7 +10734,7 @@
                     <w:szCs w:val="22"/>
                     <w:lang w:val="fr-FR" w:eastAsia="en-US" w:bidi="ar-SA"/>
                   </w:rPr>
-                  <w:t>01/06/2026</w:t>
+                  <w:t>22/05/2026</w:t>
                 </w:r>
               </w:sdtContent>
             </w:sdt>
@@ -12484,7 +12484,7 @@
                     <w:szCs w:val="22"/>
                     <w:lang w:val="fr-FR" w:eastAsia="en-US" w:bidi="ar-SA"/>
                   </w:rPr>
-                  <w:t>01/06/2024</w:t>
+                  <w:t>26/05/2025</w:t>
                 </w:r>
               </w:sdtContent>
             </w:sdt>
@@ -12581,7 +12581,7 @@
                     <w:szCs w:val="22"/>
                     <w:lang w:val="fr-FR" w:eastAsia="en-US" w:bidi="ar-SA"/>
                   </w:rPr>
-                  <w:t>01/06/2026</w:t>
+                  <w:t>22/05/2026</w:t>
                 </w:r>
               </w:sdtContent>
             </w:sdt>
@@ -14014,7 +14014,7 @@
                     <w:szCs w:val="22"/>
                     <w:lang w:val="fr-FR" w:eastAsia="en-US" w:bidi="ar-SA"/>
                   </w:rPr>
-                  <w:t>01/06/2024</w:t>
+                  <w:t>26/05/2025</w:t>
                 </w:r>
               </w:sdtContent>
             </w:sdt>
@@ -14111,7 +14111,7 @@
                     <w:szCs w:val="22"/>
                     <w:lang w:val="fr-FR" w:eastAsia="en-US" w:bidi="ar-SA"/>
                   </w:rPr>
-                  <w:t>01/06/2026</w:t>
+                  <w:t>22/05/2026</w:t>
                 </w:r>
               </w:sdtContent>
             </w:sdt>
@@ -15545,7 +15545,7 @@
                     <w:szCs w:val="22"/>
                     <w:lang w:val="fr-FR" w:eastAsia="en-US" w:bidi="ar-SA"/>
                   </w:rPr>
-                  <w:t>01/06/2024</w:t>
+                  <w:t>26/05/2025</w:t>
                 </w:r>
               </w:sdtContent>
             </w:sdt>
@@ -15642,7 +15642,7 @@
                     <w:szCs w:val="22"/>
                     <w:lang w:val="fr-FR" w:eastAsia="en-US" w:bidi="ar-SA"/>
                   </w:rPr>
-                  <w:t>01/06/2026</w:t>
+                  <w:t>22/05/2026</w:t>
                 </w:r>
               </w:sdtContent>
             </w:sdt>
@@ -17392,7 +17392,7 @@
                     <w:szCs w:val="22"/>
                     <w:lang w:val="fr-FR" w:eastAsia="en-US" w:bidi="ar-SA"/>
                   </w:rPr>
-                  <w:t>01/06/2024</w:t>
+                  <w:t>26/05/2025</w:t>
                 </w:r>
               </w:sdtContent>
             </w:sdt>
@@ -17489,7 +17489,7 @@
                     <w:szCs w:val="22"/>
                     <w:lang w:val="fr-FR" w:eastAsia="en-US" w:bidi="ar-SA"/>
                   </w:rPr>
-                  <w:t>01/06/2026</w:t>
+                  <w:t>22/05/2026</w:t>
                 </w:r>
               </w:sdtContent>
             </w:sdt>
@@ -18925,7 +18925,7 @@
                     <w:szCs w:val="22"/>
                     <w:lang w:val="fr-FR" w:eastAsia="en-US" w:bidi="ar-SA"/>
                   </w:rPr>
-                  <w:t>01/06/2024</w:t>
+                  <w:t>26/05/2025</w:t>
                 </w:r>
               </w:sdtContent>
             </w:sdt>
@@ -19022,7 +19022,7 @@
                     <w:szCs w:val="22"/>
                     <w:lang w:val="fr-FR" w:eastAsia="en-US" w:bidi="ar-SA"/>
                   </w:rPr>
-                  <w:t>01/06/2026</w:t>
+                  <w:t>22/05/2026</w:t>
                 </w:r>
               </w:sdtContent>
             </w:sdt>
@@ -20454,7 +20454,7 @@
                     <w:szCs w:val="22"/>
                     <w:lang w:val="fr-FR" w:eastAsia="en-US" w:bidi="ar-SA"/>
                   </w:rPr>
-                  <w:t>01/06/2024</w:t>
+                  <w:t>26/05/2025</w:t>
                 </w:r>
               </w:sdtContent>
             </w:sdt>
@@ -20551,7 +20551,7 @@
                     <w:szCs w:val="22"/>
                     <w:lang w:val="fr-FR" w:eastAsia="en-US" w:bidi="ar-SA"/>
                   </w:rPr>
-                  <w:t>01/06/2026</w:t>
+                  <w:t>22/05/2026</w:t>
                 </w:r>
               </w:sdtContent>
             </w:sdt>

</xml_diff>

<commit_message>
docs(dp): périodes corrigées — 26/05/2025 → 18/09/2025 (dernier commit 2025)
Co-Authored-By: Claude Sonnet 4.6 <noreply@anthropic.com>
</commit_message>
<xml_diff>
--- a/dossier-certification/Dossier_Professionnel_Social_Network_COMPLET.docx
+++ b/dossier-certification/Dossier_Professionnel_Social_Network_COMPLET.docx
@@ -7672,7 +7672,7 @@
                     <w:szCs w:val="22"/>
                     <w:lang w:val="fr-FR" w:eastAsia="en-US" w:bidi="ar-SA"/>
                   </w:rPr>
-                  <w:t>22/05/2026</w:t>
+                  <w:t>18/09/2025</w:t>
                 </w:r>
               </w:sdtContent>
             </w:sdt>
@@ -9202,7 +9202,7 @@
                     <w:szCs w:val="22"/>
                     <w:lang w:val="fr-FR" w:eastAsia="en-US" w:bidi="ar-SA"/>
                   </w:rPr>
-                  <w:t>22/05/2026</w:t>
+                  <w:t>18/09/2025</w:t>
                 </w:r>
               </w:sdtContent>
             </w:sdt>
@@ -10734,7 +10734,7 @@
                     <w:szCs w:val="22"/>
                     <w:lang w:val="fr-FR" w:eastAsia="en-US" w:bidi="ar-SA"/>
                   </w:rPr>
-                  <w:t>22/05/2026</w:t>
+                  <w:t>18/09/2025</w:t>
                 </w:r>
               </w:sdtContent>
             </w:sdt>
@@ -12581,7 +12581,7 @@
                     <w:szCs w:val="22"/>
                     <w:lang w:val="fr-FR" w:eastAsia="en-US" w:bidi="ar-SA"/>
                   </w:rPr>
-                  <w:t>22/05/2026</w:t>
+                  <w:t>18/09/2025</w:t>
                 </w:r>
               </w:sdtContent>
             </w:sdt>
@@ -14111,7 +14111,7 @@
                     <w:szCs w:val="22"/>
                     <w:lang w:val="fr-FR" w:eastAsia="en-US" w:bidi="ar-SA"/>
                   </w:rPr>
-                  <w:t>22/05/2026</w:t>
+                  <w:t>18/09/2025</w:t>
                 </w:r>
               </w:sdtContent>
             </w:sdt>
@@ -15642,7 +15642,7 @@
                     <w:szCs w:val="22"/>
                     <w:lang w:val="fr-FR" w:eastAsia="en-US" w:bidi="ar-SA"/>
                   </w:rPr>
-                  <w:t>22/05/2026</w:t>
+                  <w:t>18/09/2025</w:t>
                 </w:r>
               </w:sdtContent>
             </w:sdt>
@@ -17489,7 +17489,7 @@
                     <w:szCs w:val="22"/>
                     <w:lang w:val="fr-FR" w:eastAsia="en-US" w:bidi="ar-SA"/>
                   </w:rPr>
-                  <w:t>22/05/2026</w:t>
+                  <w:t>18/09/2025</w:t>
                 </w:r>
               </w:sdtContent>
             </w:sdt>
@@ -19022,7 +19022,7 @@
                     <w:szCs w:val="22"/>
                     <w:lang w:val="fr-FR" w:eastAsia="en-US" w:bidi="ar-SA"/>
                   </w:rPr>
-                  <w:t>22/05/2026</w:t>
+                  <w:t>18/09/2025</w:t>
                 </w:r>
               </w:sdtContent>
             </w:sdt>
@@ -20551,7 +20551,7 @@
                     <w:szCs w:val="22"/>
                     <w:lang w:val="fr-FR" w:eastAsia="en-US" w:bidi="ar-SA"/>
                   </w:rPr>
-                  <w:t>22/05/2026</w:t>
+                  <w:t>18/09/2025</w:t>
                 </w:r>
               </w:sdtContent>
             </w:sdt>

</xml_diff>

<commit_message>
docs(dp): Documents illustrant + sommaire complet (titres + pages)
- Section "Documents illustrant la pratique professionnelle" remplie :
  37 preuves (code, commits, GitHub, docs) pour AT1/AT2/AT3
- Sommaire : 9 intitulés d'exemples + numéros de page estimés

Co-Authored-By: Claude Sonnet 4.6 <noreply@anthropic.com>
</commit_message>
<xml_diff>
--- a/dossier-certification/Dossier_Professionnel_Social_Network_COMPLET.docx
+++ b/dossier-certification/Dossier_Professionnel_Social_Network_COMPLET.docx
@@ -25112,17 +25112,48 @@
                     <w:szCs w:val="22"/>
                     <w:lang w:val="fr-FR" w:eastAsia="en-US" w:bidi="ar-SA"/>
                   </w:rPr>
-                </w:r>
-                <w:r>
-                  <w:rPr>
-                    <w:rStyle w:val="PlaceholderText"/>
-                    <w:rFonts w:eastAsia="Calibri" w:cs=""/>
-                    <w:kern w:val="0"/>
-                    <w:sz w:val="22"/>
-                    <w:szCs w:val="22"/>
-                    <w:lang w:val="fr-FR" w:eastAsia="en-US" w:bidi="ar-SA"/>
-                  </w:rPr>
-                  <w:t>Cliquez ici pour taper du texte.</w:t>
+                  <w:t xml:space="preserve">Dépôt GitHub public : https://github.com/arocchet/social-network
+Vérification commits : git log --author="Lecart|CLecart|clecart" --pretty=format:"%h|%ad|%s" --date=short
+── AT1 — Authentification, Validation &amp; Réactions ──
+Code    | Signature/vérification JWT (jose)         | src/lib/jwt/signJwt.ts · verifyJwt.ts
+Code    | Hachage bcrypt cost factor 12             | src/lib/security/hash.ts
+Code    | Middleware Next.js — protection routes    | src/middleware.ts
+Code    | Route login — JWT + cookie HTTP-only      | src/app/api/public/auth/login/route.ts
+Code    | Bibliothèque 36 schémas Zod               | src/lib/schemas/
+Code    | Helpers réponse API standardisés          | src/lib/server/api/response.ts
+Code    | Modèle Prisma Reaction avec @@unique      | prisma/schema.prisma (model Reaction)
+Code    | Endpoints API réactions (CRUD + upsert)   | src/app/api/private/reaction/route.ts
+Commit  | feat: Universal likes system (08/07/2025) | hash 158d8ee
+Commit  | feat: real-time reaction counts SSE       | hash 0ca9588
+Commit  | fix(api): post auth via cookie JWT        | hash f582882
+GitHub  | PR #118 — stabilisation Docker/Neon/Redis | github.com/arocchet/social-network/pull/118
+Doc     | Analyse sécurité OWASP                    | 04-developpement/securite-rgpd.md
+── AT2 — Architecture, Messagerie &amp; Design system ──
+Code    | Schéma Prisma complet — 18 modèles        | prisma/schema.prisma
+Code    | Migrations versionnées                    | prisma/migrations/
+Diagram | MCD / MLD / MPD + diagrammes UML          | 03-conception/diagrammes-uml.md
+Code    | Endpoint SSE /chat/listen                 | src/app/api/private/chat/listen/route.ts
+Code    | Client Redis Upstash serverless           | src/lib/server/websocket/redis.ts
+Code    | Hook React useRealTimeChat                | src/hooks/use-real-time-chat.ts
+Code    | Variables CSS design system (dark mode)   | src/app/globals.css
+Code    | ThemeProvider (next-themes)               | src/components/providers/ThemeProvider.tsx
+Code    | CreatePostDialog — médias multiples       | src/components/post/CreatePostDialog.tsx
+Commit  | theme provider + palette (26/05/2025)     | hash 14f9b4a + 5399254
+Commit  | feat: CreatePost dialog responsive        | hash ce0c26a
+Commit  | docs: aligner UML sur prisma schema       | hash 06fe9e5
+GitHub  | Issue #37 — Chat system (SSE + Redis)     | github.com/arocchet/social-network/issues/37
+── AT3 — Docker, CI/CD, Déploiement &amp; Monitoring ──
+Code   | Dockerfile multi-stage (builder + runner)  | Dockerfile
+Code   | docker-compose.yml — profils dev/prod      | docker-compose.yml
+Code   | Pipeline GitHub Actions                    | .github/workflows/ci.yml
+Code   | Configuration Prisma Neon (2 URLs)         | prisma/schema.prisma (datasource db)
+Code   | Variables d'environnement documentées      | .env.exemple
+Code   | Migrations Prisma versionnées              | prisma/migrations/
+GitHub | Issue #40 — DevOps / Docker / CI           | github.com/arocchet/social-network/issues/40
+GitHub | Issue #45 — CI lint/test/build/push        | github.com/arocchet/social-network/issues/45
+GitHub | PR #118 — stabilisation déploiement        | github.com/arocchet/social-network/pull/118
+Commit | fix: resolve dependency conflicts          | hash c3748ea
+Doc    | Documentation déploiement + runbook        | 05-deploiement/README.md</w:t>
                 </w:r>
               </w:sdtContent>
             </w:sdt>

</xml_diff>